<commit_message>
The project documentation has been updated to include information persistence via a database.
</commit_message>
<xml_diff>
--- a/Documentacion Proyecto Final.docx
+++ b/Documentacion Proyecto Final.docx
@@ -132,7 +132,7 @@
           <w:r>
             <w:fldChar w:fldCharType="separate"/>
           </w:r>
-          <w:hyperlink w:anchor="_Toc240916951" w:history="1">
+          <w:hyperlink w:anchor="_Toc241003976" w:history="1">
             <w:r>
               <w:rPr>
                 <w:rStyle w:val="Hipervnculo"/>
@@ -179,7 +179,7 @@
                 <w:noProof/>
                 <w:webHidden/>
               </w:rPr>
-              <w:instrText xml:space="preserve"> PAGEREF _Toc240916951 \h </w:instrText>
+              <w:instrText xml:space="preserve"> PAGEREF _Toc241003976 \h </w:instrText>
             </w:r>
             <w:r>
               <w:rPr>
@@ -222,7 +222,7 @@
               <w:lang w:eastAsia="es-MX"/>
             </w:rPr>
           </w:pPr>
-          <w:hyperlink w:anchor="_Toc240916952" w:history="1">
+          <w:hyperlink w:anchor="_Toc241003977" w:history="1">
             <w:r>
               <w:rPr>
                 <w:rStyle w:val="Hipervnculo"/>
@@ -252,7 +252,7 @@
                 <w:noProof/>
                 <w:webHidden/>
               </w:rPr>
-              <w:instrText xml:space="preserve"> PAGEREF _Toc240916952 \h </w:instrText>
+              <w:instrText xml:space="preserve"> PAGEREF _Toc241003977 \h </w:instrText>
             </w:r>
             <w:r>
               <w:rPr>
@@ -295,7 +295,7 @@
               <w:lang w:eastAsia="es-MX"/>
             </w:rPr>
           </w:pPr>
-          <w:hyperlink w:anchor="_Toc240916953" w:history="1">
+          <w:hyperlink w:anchor="_Toc241003978" w:history="1">
             <w:r>
               <w:rPr>
                 <w:rStyle w:val="Hipervnculo"/>
@@ -325,7 +325,7 @@
                 <w:noProof/>
                 <w:webHidden/>
               </w:rPr>
-              <w:instrText xml:space="preserve"> PAGEREF _Toc240916953 \h </w:instrText>
+              <w:instrText xml:space="preserve"> PAGEREF _Toc241003978 \h </w:instrText>
             </w:r>
             <w:r>
               <w:rPr>
@@ -368,7 +368,7 @@
               <w:lang w:eastAsia="es-MX"/>
             </w:rPr>
           </w:pPr>
-          <w:hyperlink w:anchor="_Toc240916954" w:history="1">
+          <w:hyperlink w:anchor="_Toc241003979" w:history="1">
             <w:r>
               <w:rPr>
                 <w:rStyle w:val="Hipervnculo"/>
@@ -398,7 +398,7 @@
                 <w:noProof/>
                 <w:webHidden/>
               </w:rPr>
-              <w:instrText xml:space="preserve"> PAGEREF _Toc240916954 \h </w:instrText>
+              <w:instrText xml:space="preserve"> PAGEREF _Toc241003979 \h </w:instrText>
             </w:r>
             <w:r>
               <w:rPr>
@@ -441,7 +441,7 @@
               <w:lang w:eastAsia="es-MX"/>
             </w:rPr>
           </w:pPr>
-          <w:hyperlink w:anchor="_Toc240916955" w:history="1">
+          <w:hyperlink w:anchor="_Toc241003980" w:history="1">
             <w:r>
               <w:rPr>
                 <w:rStyle w:val="Hipervnculo"/>
@@ -471,7 +471,7 @@
                 <w:noProof/>
                 <w:webHidden/>
               </w:rPr>
-              <w:instrText xml:space="preserve"> PAGEREF _Toc240916955 \h </w:instrText>
+              <w:instrText xml:space="preserve"> PAGEREF _Toc241003980 \h </w:instrText>
             </w:r>
             <w:r>
               <w:rPr>
@@ -514,7 +514,7 @@
               <w:lang w:eastAsia="es-MX"/>
             </w:rPr>
           </w:pPr>
-          <w:hyperlink w:anchor="_Toc240916956" w:history="1">
+          <w:hyperlink w:anchor="_Toc241003981" w:history="1">
             <w:r>
               <w:rPr>
                 <w:rStyle w:val="Hipervnculo"/>
@@ -544,7 +544,7 @@
                 <w:noProof/>
                 <w:webHidden/>
               </w:rPr>
-              <w:instrText xml:space="preserve"> PAGEREF _Toc240916956 \h </w:instrText>
+              <w:instrText xml:space="preserve"> PAGEREF _Toc241003981 \h </w:instrText>
             </w:r>
             <w:r>
               <w:rPr>
@@ -587,7 +587,7 @@
               <w:lang w:eastAsia="es-MX"/>
             </w:rPr>
           </w:pPr>
-          <w:hyperlink w:anchor="_Toc240916957" w:history="1">
+          <w:hyperlink w:anchor="_Toc241003982" w:history="1">
             <w:r>
               <w:rPr>
                 <w:rStyle w:val="Hipervnculo"/>
@@ -617,7 +617,7 @@
                 <w:noProof/>
                 <w:webHidden/>
               </w:rPr>
-              <w:instrText xml:space="preserve"> PAGEREF _Toc240916957 \h </w:instrText>
+              <w:instrText xml:space="preserve"> PAGEREF _Toc241003982 \h </w:instrText>
             </w:r>
             <w:r>
               <w:rPr>
@@ -660,7 +660,7 @@
               <w:lang w:eastAsia="es-MX"/>
             </w:rPr>
           </w:pPr>
-          <w:hyperlink w:anchor="_Toc240916958" w:history="1">
+          <w:hyperlink w:anchor="_Toc241003983" w:history="1">
             <w:r>
               <w:rPr>
                 <w:rStyle w:val="Hipervnculo"/>
@@ -690,7 +690,7 @@
                 <w:noProof/>
                 <w:webHidden/>
               </w:rPr>
-              <w:instrText xml:space="preserve"> PAGEREF _Toc240916958 \h </w:instrText>
+              <w:instrText xml:space="preserve"> PAGEREF _Toc241003983 \h </w:instrText>
             </w:r>
             <w:r>
               <w:rPr>
@@ -733,7 +733,7 @@
               <w:lang w:eastAsia="es-MX"/>
             </w:rPr>
           </w:pPr>
-          <w:hyperlink w:anchor="_Toc240916959" w:history="1">
+          <w:hyperlink w:anchor="_Toc241003984" w:history="1">
             <w:r>
               <w:rPr>
                 <w:rStyle w:val="Hipervnculo"/>
@@ -763,7 +763,7 @@
                 <w:noProof/>
                 <w:webHidden/>
               </w:rPr>
-              <w:instrText xml:space="preserve"> PAGEREF _Toc240916959 \h </w:instrText>
+              <w:instrText xml:space="preserve"> PAGEREF _Toc241003984 \h </w:instrText>
             </w:r>
             <w:r>
               <w:rPr>
@@ -806,7 +806,7 @@
               <w:lang w:eastAsia="es-MX"/>
             </w:rPr>
           </w:pPr>
-          <w:hyperlink w:anchor="_Toc240916960" w:history="1">
+          <w:hyperlink w:anchor="_Toc241003985" w:history="1">
             <w:r>
               <w:rPr>
                 <w:rStyle w:val="Hipervnculo"/>
@@ -836,7 +836,7 @@
                 <w:noProof/>
                 <w:webHidden/>
               </w:rPr>
-              <w:instrText xml:space="preserve"> PAGEREF _Toc240916960 \h </w:instrText>
+              <w:instrText xml:space="preserve"> PAGEREF _Toc241003985 \h </w:instrText>
             </w:r>
             <w:r>
               <w:rPr>
@@ -879,7 +879,7 @@
               <w:lang w:eastAsia="es-MX"/>
             </w:rPr>
           </w:pPr>
-          <w:hyperlink w:anchor="_Toc240916961" w:history="1">
+          <w:hyperlink w:anchor="_Toc241003986" w:history="1">
             <w:r>
               <w:rPr>
                 <w:rStyle w:val="Hipervnculo"/>
@@ -909,7 +909,7 @@
                 <w:noProof/>
                 <w:webHidden/>
               </w:rPr>
-              <w:instrText xml:space="preserve"> PAGEREF _Toc240916961 \h </w:instrText>
+              <w:instrText xml:space="preserve"> PAGEREF _Toc241003986 \h </w:instrText>
             </w:r>
             <w:r>
               <w:rPr>
@@ -952,7 +952,7 @@
               <w:lang w:eastAsia="es-MX"/>
             </w:rPr>
           </w:pPr>
-          <w:hyperlink w:anchor="_Toc240916962" w:history="1">
+          <w:hyperlink w:anchor="_Toc241003987" w:history="1">
             <w:r>
               <w:rPr>
                 <w:rStyle w:val="Hipervnculo"/>
@@ -982,7 +982,7 @@
                 <w:noProof/>
                 <w:webHidden/>
               </w:rPr>
-              <w:instrText xml:space="preserve"> PAGEREF _Toc240916962 \h </w:instrText>
+              <w:instrText xml:space="preserve"> PAGEREF _Toc241003987 \h </w:instrText>
             </w:r>
             <w:r>
               <w:rPr>
@@ -1025,7 +1025,7 @@
               <w:lang w:eastAsia="es-MX"/>
             </w:rPr>
           </w:pPr>
-          <w:hyperlink w:anchor="_Toc240916963" w:history="1">
+          <w:hyperlink w:anchor="_Toc241003988" w:history="1">
             <w:r>
               <w:rPr>
                 <w:rStyle w:val="Hipervnculo"/>
@@ -1055,7 +1055,7 @@
                 <w:noProof/>
                 <w:webHidden/>
               </w:rPr>
-              <w:instrText xml:space="preserve"> PAGEREF _Toc240916963 \h </w:instrText>
+              <w:instrText xml:space="preserve"> PAGEREF _Toc241003988 \h </w:instrText>
             </w:r>
             <w:r>
               <w:rPr>
@@ -1098,7 +1098,7 @@
               <w:lang w:eastAsia="es-MX"/>
             </w:rPr>
           </w:pPr>
-          <w:hyperlink w:anchor="_Toc240916964" w:history="1">
+          <w:hyperlink w:anchor="_Toc241003989" w:history="1">
             <w:r>
               <w:rPr>
                 <w:rStyle w:val="Hipervnculo"/>
@@ -1128,7 +1128,7 @@
                 <w:noProof/>
                 <w:webHidden/>
               </w:rPr>
-              <w:instrText xml:space="preserve"> PAGEREF _Toc240916964 \h </w:instrText>
+              <w:instrText xml:space="preserve"> PAGEREF _Toc241003989 \h </w:instrText>
             </w:r>
             <w:r>
               <w:rPr>
@@ -1171,7 +1171,7 @@
               <w:lang w:eastAsia="es-MX"/>
             </w:rPr>
           </w:pPr>
-          <w:hyperlink w:anchor="_Toc240916965" w:history="1">
+          <w:hyperlink w:anchor="_Toc241003990" w:history="1">
             <w:r>
               <w:rPr>
                 <w:rStyle w:val="Hipervnculo"/>
@@ -1201,7 +1201,7 @@
                 <w:noProof/>
                 <w:webHidden/>
               </w:rPr>
-              <w:instrText xml:space="preserve"> PAGEREF _Toc240916965 \h </w:instrText>
+              <w:instrText xml:space="preserve"> PAGEREF _Toc241003990 \h </w:instrText>
             </w:r>
             <w:r>
               <w:rPr>
@@ -1244,7 +1244,7 @@
               <w:lang w:eastAsia="es-MX"/>
             </w:rPr>
           </w:pPr>
-          <w:hyperlink w:anchor="_Toc240916966" w:history="1">
+          <w:hyperlink w:anchor="_Toc241003991" w:history="1">
             <w:r>
               <w:rPr>
                 <w:rStyle w:val="Hipervnculo"/>
@@ -1274,7 +1274,7 @@
                 <w:noProof/>
                 <w:webHidden/>
               </w:rPr>
-              <w:instrText xml:space="preserve"> PAGEREF _Toc240916966 \h </w:instrText>
+              <w:instrText xml:space="preserve"> PAGEREF _Toc241003991 \h </w:instrText>
             </w:r>
             <w:r>
               <w:rPr>
@@ -1317,7 +1317,7 @@
               <w:lang w:eastAsia="es-MX"/>
             </w:rPr>
           </w:pPr>
-          <w:hyperlink w:anchor="_Toc240916967" w:history="1">
+          <w:hyperlink w:anchor="_Toc241003992" w:history="1">
             <w:r>
               <w:rPr>
                 <w:rStyle w:val="Hipervnculo"/>
@@ -1347,7 +1347,7 @@
                 <w:noProof/>
                 <w:webHidden/>
               </w:rPr>
-              <w:instrText xml:space="preserve"> PAGEREF _Toc240916967 \h </w:instrText>
+              <w:instrText xml:space="preserve"> PAGEREF _Toc241003992 \h </w:instrText>
             </w:r>
             <w:r>
               <w:rPr>
@@ -1390,7 +1390,7 @@
               <w:lang w:eastAsia="es-MX"/>
             </w:rPr>
           </w:pPr>
-          <w:hyperlink w:anchor="_Toc240916968" w:history="1">
+          <w:hyperlink w:anchor="_Toc241003993" w:history="1">
             <w:r>
               <w:rPr>
                 <w:rStyle w:val="Hipervnculo"/>
@@ -1420,7 +1420,7 @@
                 <w:noProof/>
                 <w:webHidden/>
               </w:rPr>
-              <w:instrText xml:space="preserve"> PAGEREF _Toc240916968 \h </w:instrText>
+              <w:instrText xml:space="preserve"> PAGEREF _Toc241003993 \h </w:instrText>
             </w:r>
             <w:r>
               <w:rPr>
@@ -1440,7 +1440,7 @@
                 <w:noProof/>
                 <w:webHidden/>
               </w:rPr>
-              <w:t>48</w:t>
+              <w:t>49</w:t>
             </w:r>
             <w:r>
               <w:rPr>
@@ -1497,7 +1497,7 @@
           <w:szCs w:val="32"/>
         </w:rPr>
       </w:pPr>
-      <w:bookmarkStart w:id="1" w:name="_Toc240916951"/>
+      <w:bookmarkStart w:id="1" w:name="_Toc241003976"/>
       <w:r>
         <w:rPr>
           <w:rFonts w:ascii="Open Sans" w:eastAsiaTheme="minorHAnsi" w:hAnsi="Open Sans" w:cs="Open Sans"/>
@@ -1661,7 +1661,7 @@
       <w:bookmarkStart w:id="2" w:name="_Toc238245596"/>
       <w:bookmarkStart w:id="3" w:name="_Toc239195290"/>
       <w:bookmarkStart w:id="4" w:name="_Toc239453191"/>
-      <w:bookmarkStart w:id="5" w:name="_Toc240916952"/>
+      <w:bookmarkStart w:id="5" w:name="_Toc241003977"/>
       <w:r>
         <w:rPr>
           <w:rFonts w:ascii="Open Sans" w:eastAsiaTheme="minorHAnsi" w:hAnsi="Open Sans" w:cs="Open Sans"/>
@@ -1793,7 +1793,7 @@
           <w:szCs w:val="32"/>
         </w:rPr>
       </w:pPr>
-      <w:bookmarkStart w:id="9" w:name="_Toc240916953"/>
+      <w:bookmarkStart w:id="9" w:name="_Toc241003978"/>
       <w:r>
         <w:rPr>
           <w:rFonts w:ascii="Open Sans" w:eastAsiaTheme="minorHAnsi" w:hAnsi="Open Sans" w:cs="Open Sans"/>
@@ -2293,7 +2293,7 @@
           <w:szCs w:val="32"/>
         </w:rPr>
       </w:pPr>
-      <w:bookmarkStart w:id="13" w:name="_Toc240916954"/>
+      <w:bookmarkStart w:id="13" w:name="_Toc241003979"/>
       <w:r>
         <w:rPr>
           <w:rFonts w:ascii="Open Sans" w:eastAsiaTheme="minorHAnsi" w:hAnsi="Open Sans" w:cs="Open Sans"/>
@@ -2357,7 +2357,7 @@
           <w:szCs w:val="28"/>
         </w:rPr>
       </w:pPr>
-      <w:bookmarkStart w:id="14" w:name="_Toc240916955"/>
+      <w:bookmarkStart w:id="14" w:name="_Toc241003980"/>
       <w:r>
         <w:rPr>
           <w:rFonts w:ascii="Open Sans" w:eastAsiaTheme="minorHAnsi" w:hAnsi="Open Sans" w:cs="Open Sans"/>
@@ -2891,7 +2891,7 @@
           <w:szCs w:val="22"/>
         </w:rPr>
       </w:pPr>
-      <w:bookmarkStart w:id="15" w:name="_Toc240916956"/>
+      <w:bookmarkStart w:id="15" w:name="_Toc241003981"/>
       <w:r>
         <w:rPr>
           <w:rFonts w:ascii="Open Sans" w:eastAsiaTheme="minorHAnsi" w:hAnsi="Open Sans" w:cs="Open Sans"/>
@@ -2911,12 +2911,16 @@
         <w:jc w:val="both"/>
         <w:rPr>
           <w:rFonts w:ascii="Open Sans" w:hAnsi="Open Sans" w:cs="Open Sans"/>
+          <w:sz w:val="22"/>
+          <w:szCs w:val="22"/>
         </w:rPr>
       </w:pPr>
       <w:r>
         <w:rPr>
           <w:rFonts w:ascii="Open Sans" w:hAnsi="Open Sans" w:cs="Open Sans"/>
           <w:color w:val="222222"/>
+          <w:sz w:val="22"/>
+          <w:szCs w:val="22"/>
         </w:rPr>
         <w:t>El sistema es una aplicación de escritorio (Java Swing) que simula la gestión de tareas dentro de una organización, integrando en una sola interfaz gráfica múltiples estructuras de datos y algoritmos vistos a lo largo del curso. Permite registrar tareas asignándolas a distintas estructuras según su naturaleza (urgentes, programadas, generales o priorizadas), administrar empleados mediante un árbol binario de búsqueda, calcular métricas mediante recursividad, distribuir carga de trabajo con divide y vencerás, realizar búsquedas eficientes con tablas hash y búsqueda binaria, ordenar tareas con QuickSort, y modelar dependencias entre tareas mediante un grafo dirigido con orden topológico.</w:t>
       </w:r>
@@ -2927,41 +2931,91 @@
         <w:jc w:val="both"/>
         <w:rPr>
           <w:rFonts w:ascii="Open Sans" w:hAnsi="Open Sans" w:cs="Open Sans"/>
+          <w:sz w:val="22"/>
+          <w:szCs w:val="22"/>
         </w:rPr>
       </w:pPr>
       <w:r>
         <w:rPr>
           <w:rFonts w:ascii="Open Sans" w:hAnsi="Open Sans" w:cs="Open Sans"/>
           <w:color w:val="222222"/>
+          <w:sz w:val="22"/>
+          <w:szCs w:val="22"/>
         </w:rPr>
         <w:t>La interfaz gráfica está redactada en lenguaje orientado al usuario final (por ejemplo, "Cálculos y Distribución" o "Buscar Tarea por ID" en lugar de nombrar directamente los algoritmos); la terminología técnica de cada estructura se documenta en los comentarios del código fuente y en este documento.</w:t>
       </w:r>
     </w:p>
     <w:p>
       <w:pPr>
-        <w:spacing w:after="80"/>
-        <w:jc w:val="both"/>
-        <w:rPr>
-          <w:rFonts w:ascii="Open Sans" w:hAnsi="Open Sans" w:cs="Open Sans"/>
-        </w:rPr>
-      </w:pPr>
-      <w:r>
-        <w:rPr>
-          <w:rFonts w:ascii="Open Sans" w:hAnsi="Open Sans" w:cs="Open Sans"/>
-          <w:color w:val="222222"/>
-        </w:rPr>
-        <w:t>La aplicación no persiste información en disco ni en base de datos: todos los datos (tareas, empleados, dependencias) existen únicamente en memoria mientras el programa se está ejecutando y se pierden al cerrarlo.</w:t>
-      </w:r>
-    </w:p>
-    <w:p>
-      <w:pPr>
-        <w:jc w:val="both"/>
-        <w:rPr>
-          <w:rFonts w:ascii="Open Sans" w:hAnsi="Open Sans" w:cs="Open Sans"/>
-          <w:sz w:val="22"/>
-          <w:szCs w:val="22"/>
-        </w:rPr>
-      </w:pPr>
+        <w:jc w:val="both"/>
+        <w:rPr>
+          <w:rFonts w:ascii="Open Sans" w:hAnsi="Open Sans" w:cs="Open Sans"/>
+          <w:sz w:val="22"/>
+          <w:szCs w:val="22"/>
+        </w:rPr>
+      </w:pPr>
+      <w:r>
+        <w:rPr>
+          <w:rFonts w:ascii="Open Sans" w:hAnsi="Open Sans" w:cs="Open Sans"/>
+          <w:sz w:val="22"/>
+          <w:szCs w:val="22"/>
+        </w:rPr>
+        <w:t xml:space="preserve">La aplicación persiste la información de tareas y empleados en una base de datos, mediante una capa de persistencia dedicada (paquete persistencia, con las clases </w:t>
+      </w:r>
+      <w:proofErr w:type="spellStart"/>
+      <w:r>
+        <w:rPr>
+          <w:rFonts w:ascii="Open Sans" w:hAnsi="Open Sans" w:cs="Open Sans"/>
+          <w:sz w:val="22"/>
+          <w:szCs w:val="22"/>
+        </w:rPr>
+        <w:t>ConexionBD</w:t>
+      </w:r>
+      <w:proofErr w:type="spellEnd"/>
+      <w:r>
+        <w:rPr>
+          <w:rFonts w:ascii="Open Sans" w:hAnsi="Open Sans" w:cs="Open Sans"/>
+          <w:sz w:val="22"/>
+          <w:szCs w:val="22"/>
+        </w:rPr>
+        <w:t xml:space="preserve">, </w:t>
+      </w:r>
+      <w:proofErr w:type="spellStart"/>
+      <w:r>
+        <w:rPr>
+          <w:rFonts w:ascii="Open Sans" w:hAnsi="Open Sans" w:cs="Open Sans"/>
+          <w:sz w:val="22"/>
+          <w:szCs w:val="22"/>
+        </w:rPr>
+        <w:t>TareaRepositorio</w:t>
+      </w:r>
+      <w:proofErr w:type="spellEnd"/>
+      <w:r>
+        <w:rPr>
+          <w:rFonts w:ascii="Open Sans" w:hAnsi="Open Sans" w:cs="Open Sans"/>
+          <w:sz w:val="22"/>
+          <w:szCs w:val="22"/>
+        </w:rPr>
+        <w:t xml:space="preserve"> y </w:t>
+      </w:r>
+      <w:proofErr w:type="spellStart"/>
+      <w:r>
+        <w:rPr>
+          <w:rFonts w:ascii="Open Sans" w:hAnsi="Open Sans" w:cs="Open Sans"/>
+          <w:sz w:val="22"/>
+          <w:szCs w:val="22"/>
+        </w:rPr>
+        <w:t>EmpleadoRepositorio</w:t>
+      </w:r>
+      <w:proofErr w:type="spellEnd"/>
+      <w:r>
+        <w:rPr>
+          <w:rFonts w:ascii="Open Sans" w:hAnsi="Open Sans" w:cs="Open Sans"/>
+          <w:sz w:val="22"/>
+          <w:szCs w:val="22"/>
+        </w:rPr>
+        <w:t>). Esto permite conservar la información entre distintas ejecuciones del programa, a diferencia de las estructuras de datos en memoria (Pila, Cola, Lista, Árbol, Grafo), que siguen existiendo únicamente durante cada sesión y se reconstruyen a partir de la base de datos al iniciar la aplicación.</w:t>
+      </w:r>
     </w:p>
     <w:p>
       <w:pPr>
@@ -2976,7 +3030,7 @@
           <w:szCs w:val="22"/>
         </w:rPr>
       </w:pPr>
-      <w:bookmarkStart w:id="16" w:name="_Toc240916957"/>
+      <w:bookmarkStart w:id="16" w:name="_Toc241003982"/>
       <w:r>
         <w:rPr>
           <w:rFonts w:ascii="Open Sans" w:eastAsiaTheme="minorHAnsi" w:hAnsi="Open Sans" w:cs="Open Sans"/>
@@ -3370,7 +3424,7 @@
           <w:szCs w:val="22"/>
         </w:rPr>
       </w:pPr>
-      <w:bookmarkStart w:id="17" w:name="_Toc240916958"/>
+      <w:bookmarkStart w:id="17" w:name="_Toc241003983"/>
       <w:r>
         <w:rPr>
           <w:rFonts w:ascii="Open Sans" w:eastAsiaTheme="minorHAnsi" w:hAnsi="Open Sans" w:cs="Open Sans"/>
@@ -3412,6 +3466,9 @@
           <w:szCs w:val="20"/>
         </w:rPr>
       </w:pPr>
+      <w:bookmarkStart w:id="18" w:name="_Toc238245599"/>
+      <w:bookmarkStart w:id="19" w:name="_Toc239195293"/>
+      <w:bookmarkStart w:id="20" w:name="_Toc239453194"/>
       <w:proofErr w:type="spellStart"/>
       <w:r>
         <w:rPr>
@@ -3422,642 +3479,473 @@
         <w:t>com.example</w:t>
       </w:r>
       <w:proofErr w:type="spellEnd"/>
-      <w:r>
+    </w:p>
+    <w:p>
+      <w:pPr>
+        <w:shd w:val="clear" w:color="auto" w:fill="F2F2F2" w:themeFill="background1" w:themeFillShade="F2"/>
         <w:rPr>
           <w:rFonts w:ascii="Consolas" w:hAnsi="Consolas" w:cs="Open Sans"/>
           <w:sz w:val="20"/>
           <w:szCs w:val="20"/>
         </w:rPr>
-        <w:br/>
-      </w:r>
-      <w:r>
-        <w:rPr>
-          <w:rFonts w:ascii="Consolas" w:hAnsi="Consolas" w:cs="Arial"/>
-          <w:sz w:val="20"/>
-          <w:szCs w:val="20"/>
-        </w:rPr>
-        <w:t>├──</w:t>
-      </w:r>
+      </w:pPr>
       <w:r>
         <w:rPr>
           <w:rFonts w:ascii="Consolas" w:hAnsi="Consolas" w:cs="Open Sans"/>
           <w:sz w:val="20"/>
           <w:szCs w:val="20"/>
         </w:rPr>
-        <w:t xml:space="preserve"> GestionTareasApp.java (Lanzador principal)</w:t>
-      </w:r>
+        <w:t xml:space="preserve">├── GestionTareasApp.java                  </w:t>
+      </w:r>
+      <w:proofErr w:type="gramStart"/>
       <w:r>
         <w:rPr>
           <w:rFonts w:ascii="Consolas" w:hAnsi="Consolas" w:cs="Open Sans"/>
           <w:sz w:val="20"/>
           <w:szCs w:val="20"/>
         </w:rPr>
-        <w:br/>
-      </w:r>
-      <w:r>
-        <w:rPr>
-          <w:rFonts w:ascii="Consolas" w:hAnsi="Consolas" w:cs="Arial"/>
-          <w:sz w:val="20"/>
-          <w:szCs w:val="20"/>
-        </w:rPr>
-        <w:t>├──</w:t>
-      </w:r>
+        <w:t xml:space="preserve">   (</w:t>
+      </w:r>
+      <w:proofErr w:type="gramEnd"/>
       <w:r>
         <w:rPr>
           <w:rFonts w:ascii="Consolas" w:hAnsi="Consolas" w:cs="Open Sans"/>
           <w:sz w:val="20"/>
           <w:szCs w:val="20"/>
         </w:rPr>
-        <w:t xml:space="preserve"> Controlador/</w:t>
-      </w:r>
-      <w:r>
+        <w:t>Lanzador principal)</w:t>
+      </w:r>
+    </w:p>
+    <w:p>
+      <w:pPr>
+        <w:shd w:val="clear" w:color="auto" w:fill="F2F2F2" w:themeFill="background1" w:themeFillShade="F2"/>
         <w:rPr>
           <w:rFonts w:ascii="Consolas" w:hAnsi="Consolas" w:cs="Open Sans"/>
           <w:sz w:val="20"/>
           <w:szCs w:val="20"/>
         </w:rPr>
-        <w:br/>
-      </w:r>
-      <w:r>
-        <w:rPr>
-          <w:rFonts w:ascii="Consolas" w:hAnsi="Consolas" w:cs="Arial"/>
-          <w:sz w:val="20"/>
-          <w:szCs w:val="20"/>
-        </w:rPr>
-        <w:t>│</w:t>
-      </w:r>
+      </w:pPr>
       <w:r>
         <w:rPr>
           <w:rFonts w:ascii="Consolas" w:hAnsi="Consolas" w:cs="Open Sans"/>
           <w:sz w:val="20"/>
           <w:szCs w:val="20"/>
         </w:rPr>
-        <w:t xml:space="preserve"> </w:t>
-      </w:r>
-      <w:r>
-        <w:rPr>
-          <w:rFonts w:ascii="Consolas" w:hAnsi="Consolas" w:cs="Arial"/>
-          <w:sz w:val="20"/>
-          <w:szCs w:val="20"/>
-        </w:rPr>
-        <w:t>└──</w:t>
-      </w:r>
-      <w:r>
+        <w:t>├── Controlador/</w:t>
+      </w:r>
+    </w:p>
+    <w:p>
+      <w:pPr>
+        <w:shd w:val="clear" w:color="auto" w:fill="F2F2F2" w:themeFill="background1" w:themeFillShade="F2"/>
         <w:rPr>
           <w:rFonts w:ascii="Consolas" w:hAnsi="Consolas" w:cs="Open Sans"/>
           <w:sz w:val="20"/>
           <w:szCs w:val="20"/>
         </w:rPr>
-        <w:t xml:space="preserve"> GestionTareasController.java (Lógica de control / </w:t>
-      </w:r>
-      <w:proofErr w:type="spellStart"/>
+      </w:pPr>
       <w:r>
         <w:rPr>
           <w:rFonts w:ascii="Consolas" w:hAnsi="Consolas" w:cs="Open Sans"/>
           <w:sz w:val="20"/>
           <w:szCs w:val="20"/>
         </w:rPr>
-        <w:t>listeners</w:t>
-      </w:r>
-      <w:proofErr w:type="spellEnd"/>
+        <w:t xml:space="preserve">│   └── GestionTareasController.java      </w:t>
+      </w:r>
+      <w:proofErr w:type="gramStart"/>
       <w:r>
         <w:rPr>
           <w:rFonts w:ascii="Consolas" w:hAnsi="Consolas" w:cs="Open Sans"/>
           <w:sz w:val="20"/>
           <w:szCs w:val="20"/>
         </w:rPr>
-        <w:t>)</w:t>
-      </w:r>
+        <w:t xml:space="preserve">   (</w:t>
+      </w:r>
+      <w:proofErr w:type="gramEnd"/>
       <w:r>
         <w:rPr>
           <w:rFonts w:ascii="Consolas" w:hAnsi="Consolas" w:cs="Open Sans"/>
           <w:sz w:val="20"/>
           <w:szCs w:val="20"/>
         </w:rPr>
-        <w:br/>
-      </w:r>
-      <w:r>
-        <w:rPr>
-          <w:rFonts w:ascii="Consolas" w:hAnsi="Consolas" w:cs="Arial"/>
-          <w:sz w:val="20"/>
-          <w:szCs w:val="20"/>
-        </w:rPr>
-        <w:t>├──</w:t>
-      </w:r>
+        <w:t xml:space="preserve">Lógica de control y </w:t>
+      </w:r>
+      <w:proofErr w:type="spellStart"/>
       <w:r>
         <w:rPr>
           <w:rFonts w:ascii="Consolas" w:hAnsi="Consolas" w:cs="Open Sans"/>
           <w:sz w:val="20"/>
           <w:szCs w:val="20"/>
         </w:rPr>
-        <w:t xml:space="preserve"> Modelo/</w:t>
-      </w:r>
+        <w:t>listeners</w:t>
+      </w:r>
+      <w:proofErr w:type="spellEnd"/>
       <w:r>
         <w:rPr>
           <w:rFonts w:ascii="Consolas" w:hAnsi="Consolas" w:cs="Open Sans"/>
           <w:sz w:val="20"/>
           <w:szCs w:val="20"/>
         </w:rPr>
-        <w:br/>
-      </w:r>
-      <w:r>
-        <w:rPr>
-          <w:rFonts w:ascii="Consolas" w:hAnsi="Consolas" w:cs="Arial"/>
-          <w:sz w:val="20"/>
-          <w:szCs w:val="20"/>
-        </w:rPr>
-        <w:t>│</w:t>
-      </w:r>
-      <w:r>
+        <w:t>)</w:t>
+      </w:r>
+    </w:p>
+    <w:p>
+      <w:pPr>
+        <w:shd w:val="clear" w:color="auto" w:fill="F2F2F2" w:themeFill="background1" w:themeFillShade="F2"/>
         <w:rPr>
           <w:rFonts w:ascii="Consolas" w:hAnsi="Consolas" w:cs="Open Sans"/>
           <w:sz w:val="20"/>
           <w:szCs w:val="20"/>
         </w:rPr>
-        <w:t xml:space="preserve"> </w:t>
-      </w:r>
-      <w:r>
-        <w:rPr>
-          <w:rFonts w:ascii="Consolas" w:hAnsi="Consolas" w:cs="Arial"/>
-          <w:sz w:val="20"/>
-          <w:szCs w:val="20"/>
-        </w:rPr>
-        <w:t>├──</w:t>
-      </w:r>
+      </w:pPr>
       <w:r>
         <w:rPr>
           <w:rFonts w:ascii="Consolas" w:hAnsi="Consolas" w:cs="Open Sans"/>
           <w:sz w:val="20"/>
           <w:szCs w:val="20"/>
         </w:rPr>
-        <w:t xml:space="preserve"> Tarea.java</w:t>
-      </w:r>
-      <w:r>
+        <w:t>├── Modelo/</w:t>
+      </w:r>
+    </w:p>
+    <w:p>
+      <w:pPr>
+        <w:shd w:val="clear" w:color="auto" w:fill="F2F2F2" w:themeFill="background1" w:themeFillShade="F2"/>
         <w:rPr>
           <w:rFonts w:ascii="Consolas" w:hAnsi="Consolas" w:cs="Open Sans"/>
           <w:sz w:val="20"/>
           <w:szCs w:val="20"/>
         </w:rPr>
-        <w:br/>
-      </w:r>
-      <w:r>
-        <w:rPr>
-          <w:rFonts w:ascii="Consolas" w:hAnsi="Consolas" w:cs="Arial"/>
-          <w:sz w:val="20"/>
-          <w:szCs w:val="20"/>
-        </w:rPr>
-        <w:t>│</w:t>
-      </w:r>
+      </w:pPr>
       <w:r>
         <w:rPr>
           <w:rFonts w:ascii="Consolas" w:hAnsi="Consolas" w:cs="Open Sans"/>
           <w:sz w:val="20"/>
           <w:szCs w:val="20"/>
         </w:rPr>
-        <w:t xml:space="preserve"> </w:t>
-      </w:r>
-      <w:r>
-        <w:rPr>
-          <w:rFonts w:ascii="Consolas" w:hAnsi="Consolas" w:cs="Arial"/>
-          <w:sz w:val="20"/>
-          <w:szCs w:val="20"/>
-        </w:rPr>
-        <w:t>├──</w:t>
-      </w:r>
-      <w:r>
+        <w:t>│   ├── Tarea.java</w:t>
+      </w:r>
+    </w:p>
+    <w:p>
+      <w:pPr>
+        <w:shd w:val="clear" w:color="auto" w:fill="F2F2F2" w:themeFill="background1" w:themeFillShade="F2"/>
         <w:rPr>
           <w:rFonts w:ascii="Consolas" w:hAnsi="Consolas" w:cs="Open Sans"/>
           <w:sz w:val="20"/>
           <w:szCs w:val="20"/>
         </w:rPr>
-        <w:t xml:space="preserve"> Empleado.java</w:t>
-      </w:r>
+      </w:pPr>
       <w:r>
         <w:rPr>
           <w:rFonts w:ascii="Consolas" w:hAnsi="Consolas" w:cs="Open Sans"/>
           <w:sz w:val="20"/>
           <w:szCs w:val="20"/>
         </w:rPr>
-        <w:br/>
-      </w:r>
-      <w:r>
-        <w:rPr>
-          <w:rFonts w:ascii="Consolas" w:hAnsi="Consolas" w:cs="Arial"/>
-          <w:sz w:val="20"/>
-          <w:szCs w:val="20"/>
-        </w:rPr>
-        <w:t>│</w:t>
-      </w:r>
-      <w:r>
+        <w:t>│   ├── Empleado.java</w:t>
+      </w:r>
+    </w:p>
+    <w:p>
+      <w:pPr>
+        <w:shd w:val="clear" w:color="auto" w:fill="F2F2F2" w:themeFill="background1" w:themeFillShade="F2"/>
         <w:rPr>
           <w:rFonts w:ascii="Consolas" w:hAnsi="Consolas" w:cs="Open Sans"/>
           <w:sz w:val="20"/>
           <w:szCs w:val="20"/>
         </w:rPr>
-        <w:t xml:space="preserve"> </w:t>
-      </w:r>
-      <w:r>
-        <w:rPr>
-          <w:rFonts w:ascii="Consolas" w:hAnsi="Consolas" w:cs="Arial"/>
-          <w:sz w:val="20"/>
-          <w:szCs w:val="20"/>
-        </w:rPr>
-        <w:t>├──</w:t>
-      </w:r>
+      </w:pPr>
       <w:r>
         <w:rPr>
           <w:rFonts w:ascii="Consolas" w:hAnsi="Consolas" w:cs="Open Sans"/>
           <w:sz w:val="20"/>
           <w:szCs w:val="20"/>
         </w:rPr>
-        <w:t xml:space="preserve"> PilaTareas.java</w:t>
-      </w:r>
-      <w:r>
+        <w:t>│   ├── PilaTareas.java</w:t>
+      </w:r>
+    </w:p>
+    <w:p>
+      <w:pPr>
+        <w:shd w:val="clear" w:color="auto" w:fill="F2F2F2" w:themeFill="background1" w:themeFillShade="F2"/>
         <w:rPr>
           <w:rFonts w:ascii="Consolas" w:hAnsi="Consolas" w:cs="Open Sans"/>
           <w:sz w:val="20"/>
           <w:szCs w:val="20"/>
         </w:rPr>
-        <w:br/>
-      </w:r>
-      <w:r>
-        <w:rPr>
-          <w:rFonts w:ascii="Consolas" w:hAnsi="Consolas" w:cs="Arial"/>
-          <w:sz w:val="20"/>
-          <w:szCs w:val="20"/>
-        </w:rPr>
-        <w:t>│</w:t>
-      </w:r>
+      </w:pPr>
       <w:r>
         <w:rPr>
           <w:rFonts w:ascii="Consolas" w:hAnsi="Consolas" w:cs="Open Sans"/>
           <w:sz w:val="20"/>
           <w:szCs w:val="20"/>
         </w:rPr>
-        <w:t xml:space="preserve"> </w:t>
-      </w:r>
-      <w:r>
-        <w:rPr>
-          <w:rFonts w:ascii="Consolas" w:hAnsi="Consolas" w:cs="Arial"/>
-          <w:sz w:val="20"/>
-          <w:szCs w:val="20"/>
-        </w:rPr>
-        <w:t>├──</w:t>
-      </w:r>
-      <w:r>
+        <w:t>│   ├── ColaTareas.java</w:t>
+      </w:r>
+    </w:p>
+    <w:p>
+      <w:pPr>
+        <w:shd w:val="clear" w:color="auto" w:fill="F2F2F2" w:themeFill="background1" w:themeFillShade="F2"/>
         <w:rPr>
           <w:rFonts w:ascii="Consolas" w:hAnsi="Consolas" w:cs="Open Sans"/>
           <w:sz w:val="20"/>
           <w:szCs w:val="20"/>
         </w:rPr>
-        <w:t xml:space="preserve"> ColaTareas.java</w:t>
-      </w:r>
+      </w:pPr>
       <w:r>
         <w:rPr>
           <w:rFonts w:ascii="Consolas" w:hAnsi="Consolas" w:cs="Open Sans"/>
           <w:sz w:val="20"/>
           <w:szCs w:val="20"/>
         </w:rPr>
-        <w:br/>
-      </w:r>
-      <w:r>
-        <w:rPr>
-          <w:rFonts w:ascii="Consolas" w:hAnsi="Consolas" w:cs="Arial"/>
-          <w:sz w:val="20"/>
-          <w:szCs w:val="20"/>
-        </w:rPr>
-        <w:t>│</w:t>
-      </w:r>
-      <w:r>
+        <w:t>│   ├── ListaTareas.java</w:t>
+      </w:r>
+    </w:p>
+    <w:p>
+      <w:pPr>
+        <w:shd w:val="clear" w:color="auto" w:fill="F2F2F2" w:themeFill="background1" w:themeFillShade="F2"/>
         <w:rPr>
           <w:rFonts w:ascii="Consolas" w:hAnsi="Consolas" w:cs="Open Sans"/>
           <w:sz w:val="20"/>
           <w:szCs w:val="20"/>
         </w:rPr>
-        <w:t xml:space="preserve"> </w:t>
-      </w:r>
-      <w:r>
-        <w:rPr>
-          <w:rFonts w:ascii="Consolas" w:hAnsi="Consolas" w:cs="Arial"/>
-          <w:sz w:val="20"/>
-          <w:szCs w:val="20"/>
-        </w:rPr>
-        <w:t>├──</w:t>
-      </w:r>
+      </w:pPr>
       <w:r>
         <w:rPr>
           <w:rFonts w:ascii="Consolas" w:hAnsi="Consolas" w:cs="Open Sans"/>
           <w:sz w:val="20"/>
           <w:szCs w:val="20"/>
         </w:rPr>
-        <w:t xml:space="preserve"> ListaTareas.java</w:t>
-      </w:r>
-      <w:r>
+        <w:t>│   ├── ColaPrioridadTareas.java</w:t>
+      </w:r>
+    </w:p>
+    <w:p>
+      <w:pPr>
+        <w:shd w:val="clear" w:color="auto" w:fill="F2F2F2" w:themeFill="background1" w:themeFillShade="F2"/>
         <w:rPr>
           <w:rFonts w:ascii="Consolas" w:hAnsi="Consolas" w:cs="Open Sans"/>
           <w:sz w:val="20"/>
           <w:szCs w:val="20"/>
         </w:rPr>
-        <w:br/>
-      </w:r>
-      <w:r>
-        <w:rPr>
-          <w:rFonts w:ascii="Consolas" w:hAnsi="Consolas" w:cs="Arial"/>
-          <w:sz w:val="20"/>
-          <w:szCs w:val="20"/>
-        </w:rPr>
-        <w:t>│</w:t>
-      </w:r>
+      </w:pPr>
       <w:r>
         <w:rPr>
           <w:rFonts w:ascii="Consolas" w:hAnsi="Consolas" w:cs="Open Sans"/>
           <w:sz w:val="20"/>
           <w:szCs w:val="20"/>
         </w:rPr>
-        <w:t xml:space="preserve"> </w:t>
-      </w:r>
-      <w:r>
-        <w:rPr>
-          <w:rFonts w:ascii="Consolas" w:hAnsi="Consolas" w:cs="Arial"/>
-          <w:sz w:val="20"/>
-          <w:szCs w:val="20"/>
-        </w:rPr>
-        <w:t>├──</w:t>
-      </w:r>
-      <w:r>
+        <w:t>│   ├── ArbolEmpleados.java</w:t>
+      </w:r>
+    </w:p>
+    <w:p>
+      <w:pPr>
+        <w:shd w:val="clear" w:color="auto" w:fill="F2F2F2" w:themeFill="background1" w:themeFillShade="F2"/>
         <w:rPr>
           <w:rFonts w:ascii="Consolas" w:hAnsi="Consolas" w:cs="Open Sans"/>
           <w:sz w:val="20"/>
           <w:szCs w:val="20"/>
         </w:rPr>
-        <w:t xml:space="preserve"> ColaPrioridadTareas.java</w:t>
-      </w:r>
+      </w:pPr>
       <w:r>
         <w:rPr>
           <w:rFonts w:ascii="Consolas" w:hAnsi="Consolas" w:cs="Open Sans"/>
           <w:sz w:val="20"/>
           <w:szCs w:val="20"/>
         </w:rPr>
-        <w:br/>
-      </w:r>
-      <w:r>
-        <w:rPr>
-          <w:rFonts w:ascii="Consolas" w:hAnsi="Consolas" w:cs="Arial"/>
-          <w:sz w:val="20"/>
-          <w:szCs w:val="20"/>
-        </w:rPr>
-        <w:t>│</w:t>
-      </w:r>
-      <w:r>
+        <w:t>│   ├── ProcesadorRecursivo.java</w:t>
+      </w:r>
+    </w:p>
+    <w:p>
+      <w:pPr>
+        <w:shd w:val="clear" w:color="auto" w:fill="F2F2F2" w:themeFill="background1" w:themeFillShade="F2"/>
         <w:rPr>
           <w:rFonts w:ascii="Consolas" w:hAnsi="Consolas" w:cs="Open Sans"/>
           <w:sz w:val="20"/>
           <w:szCs w:val="20"/>
         </w:rPr>
-        <w:t xml:space="preserve"> </w:t>
-      </w:r>
-      <w:r>
-        <w:rPr>
-          <w:rFonts w:ascii="Consolas" w:hAnsi="Consolas" w:cs="Arial"/>
-          <w:sz w:val="20"/>
-          <w:szCs w:val="20"/>
-        </w:rPr>
-        <w:t>├──</w:t>
-      </w:r>
+      </w:pPr>
       <w:r>
         <w:rPr>
           <w:rFonts w:ascii="Consolas" w:hAnsi="Consolas" w:cs="Open Sans"/>
           <w:sz w:val="20"/>
           <w:szCs w:val="20"/>
         </w:rPr>
-        <w:t xml:space="preserve"> ArbolEmpleados.java</w:t>
-      </w:r>
-      <w:r>
+        <w:t>│   ├── GestorTablasHashYAlgoritmos.java</w:t>
+      </w:r>
+    </w:p>
+    <w:p>
+      <w:pPr>
+        <w:shd w:val="clear" w:color="auto" w:fill="F2F2F2" w:themeFill="background1" w:themeFillShade="F2"/>
         <w:rPr>
           <w:rFonts w:ascii="Consolas" w:hAnsi="Consolas" w:cs="Open Sans"/>
           <w:sz w:val="20"/>
           <w:szCs w:val="20"/>
         </w:rPr>
-        <w:br/>
-      </w:r>
-      <w:r>
-        <w:rPr>
-          <w:rFonts w:ascii="Consolas" w:hAnsi="Consolas" w:cs="Arial"/>
-          <w:sz w:val="20"/>
-          <w:szCs w:val="20"/>
-        </w:rPr>
-        <w:t>│</w:t>
-      </w:r>
+      </w:pPr>
       <w:r>
         <w:rPr>
           <w:rFonts w:ascii="Consolas" w:hAnsi="Consolas" w:cs="Open Sans"/>
           <w:sz w:val="20"/>
           <w:szCs w:val="20"/>
         </w:rPr>
-        <w:t xml:space="preserve"> </w:t>
-      </w:r>
-      <w:r>
-        <w:rPr>
-          <w:rFonts w:ascii="Consolas" w:hAnsi="Consolas" w:cs="Arial"/>
-          <w:sz w:val="20"/>
-          <w:szCs w:val="20"/>
-        </w:rPr>
-        <w:t>├──</w:t>
-      </w:r>
-      <w:r>
+        <w:t>│   └── GrafoDependencias.java</w:t>
+      </w:r>
+    </w:p>
+    <w:p>
+      <w:pPr>
+        <w:shd w:val="clear" w:color="auto" w:fill="F2F2F2" w:themeFill="background1" w:themeFillShade="F2"/>
         <w:rPr>
           <w:rFonts w:ascii="Consolas" w:hAnsi="Consolas" w:cs="Open Sans"/>
           <w:sz w:val="20"/>
           <w:szCs w:val="20"/>
         </w:rPr>
-        <w:t xml:space="preserve"> ProcesadorRecursivo.java</w:t>
-      </w:r>
+      </w:pPr>
       <w:r>
         <w:rPr>
           <w:rFonts w:ascii="Consolas" w:hAnsi="Consolas" w:cs="Open Sans"/>
           <w:sz w:val="20"/>
           <w:szCs w:val="20"/>
         </w:rPr>
-        <w:br/>
-      </w:r>
-      <w:r>
-        <w:rPr>
-          <w:rFonts w:ascii="Consolas" w:hAnsi="Consolas" w:cs="Arial"/>
-          <w:sz w:val="20"/>
-          <w:szCs w:val="20"/>
-        </w:rPr>
-        <w:t>│</w:t>
-      </w:r>
-      <w:r>
+        <w:t>├── Vista/</w:t>
+      </w:r>
+    </w:p>
+    <w:p>
+      <w:pPr>
+        <w:shd w:val="clear" w:color="auto" w:fill="F2F2F2" w:themeFill="background1" w:themeFillShade="F2"/>
         <w:rPr>
           <w:rFonts w:ascii="Consolas" w:hAnsi="Consolas" w:cs="Open Sans"/>
           <w:sz w:val="20"/>
           <w:szCs w:val="20"/>
         </w:rPr>
-        <w:t xml:space="preserve"> </w:t>
-      </w:r>
-      <w:r>
-        <w:rPr>
-          <w:rFonts w:ascii="Consolas" w:hAnsi="Consolas" w:cs="Arial"/>
-          <w:sz w:val="20"/>
-          <w:szCs w:val="20"/>
-        </w:rPr>
-        <w:t>├──</w:t>
-      </w:r>
+      </w:pPr>
       <w:r>
         <w:rPr>
           <w:rFonts w:ascii="Consolas" w:hAnsi="Consolas" w:cs="Open Sans"/>
           <w:sz w:val="20"/>
           <w:szCs w:val="20"/>
         </w:rPr>
-        <w:t xml:space="preserve"> GestorTablasHashYAlgoritmos.java</w:t>
-      </w:r>
+        <w:t xml:space="preserve">│   ├── GestionTareasView.java            </w:t>
+      </w:r>
+      <w:proofErr w:type="gramStart"/>
       <w:r>
         <w:rPr>
           <w:rFonts w:ascii="Consolas" w:hAnsi="Consolas" w:cs="Open Sans"/>
           <w:sz w:val="20"/>
           <w:szCs w:val="20"/>
         </w:rPr>
-        <w:br/>
-      </w:r>
-      <w:r>
-        <w:rPr>
-          <w:rFonts w:ascii="Consolas" w:hAnsi="Consolas" w:cs="Arial"/>
-          <w:sz w:val="20"/>
-          <w:szCs w:val="20"/>
-        </w:rPr>
-        <w:t>│</w:t>
-      </w:r>
+        <w:t xml:space="preserve">   (</w:t>
+      </w:r>
+      <w:proofErr w:type="gramEnd"/>
       <w:r>
         <w:rPr>
           <w:rFonts w:ascii="Consolas" w:hAnsi="Consolas" w:cs="Open Sans"/>
           <w:sz w:val="20"/>
           <w:szCs w:val="20"/>
         </w:rPr>
-        <w:t xml:space="preserve"> </w:t>
-      </w:r>
-      <w:r>
-        <w:rPr>
-          <w:rFonts w:ascii="Consolas" w:hAnsi="Consolas" w:cs="Arial"/>
-          <w:sz w:val="20"/>
-          <w:szCs w:val="20"/>
-        </w:rPr>
-        <w:t>└──</w:t>
-      </w:r>
-      <w:r>
+        <w:t>Interfaz gráfica Swing)</w:t>
+      </w:r>
+    </w:p>
+    <w:p>
+      <w:pPr>
+        <w:shd w:val="clear" w:color="auto" w:fill="F2F2F2" w:themeFill="background1" w:themeFillShade="F2"/>
         <w:rPr>
           <w:rFonts w:ascii="Consolas" w:hAnsi="Consolas" w:cs="Open Sans"/>
           <w:sz w:val="20"/>
           <w:szCs w:val="20"/>
         </w:rPr>
-        <w:t xml:space="preserve"> GrafoDependencias.java</w:t>
-      </w:r>
-      <w:bookmarkStart w:id="18" w:name="_Toc238245599"/>
-      <w:bookmarkStart w:id="19" w:name="_Toc239195293"/>
-      <w:bookmarkStart w:id="20" w:name="_Toc239453194"/>
-    </w:p>
-    <w:p>
-      <w:pPr>
-        <w:shd w:val="clear" w:color="auto" w:fill="F2F2F2" w:themeFill="background1" w:themeFillShade="F2"/>
+      </w:pPr>
+      <w:r>
         <w:rPr>
           <w:rFonts w:ascii="Consolas" w:hAnsi="Consolas" w:cs="Open Sans"/>
           <w:sz w:val="20"/>
           <w:szCs w:val="20"/>
         </w:rPr>
-      </w:pPr>
+        <w:t xml:space="preserve">│   └── SelectorFechaPanel.java           </w:t>
+      </w:r>
+      <w:proofErr w:type="gramStart"/>
       <w:r>
         <w:rPr>
           <w:rFonts w:ascii="Consolas" w:hAnsi="Consolas" w:cs="Open Sans"/>
           <w:sz w:val="20"/>
           <w:szCs w:val="20"/>
         </w:rPr>
-        <w:t>└── Vista/</w:t>
-      </w:r>
-    </w:p>
-    <w:p>
-      <w:pPr>
-        <w:shd w:val="clear" w:color="auto" w:fill="F2F2F2" w:themeFill="background1" w:themeFillShade="F2"/>
+        <w:t xml:space="preserve">   (</w:t>
+      </w:r>
+      <w:proofErr w:type="gramEnd"/>
+      <w:r>
         <w:rPr>
           <w:rFonts w:ascii="Consolas" w:hAnsi="Consolas" w:cs="Open Sans"/>
           <w:sz w:val="20"/>
           <w:szCs w:val="20"/>
         </w:rPr>
-      </w:pPr>
-      <w:r>
+        <w:t>Selector de fecha: calendario + texto validado)</w:t>
+      </w:r>
+    </w:p>
+    <w:p>
+      <w:pPr>
+        <w:shd w:val="clear" w:color="auto" w:fill="F2F2F2" w:themeFill="background1" w:themeFillShade="F2"/>
         <w:rPr>
           <w:rFonts w:ascii="Consolas" w:hAnsi="Consolas" w:cs="Open Sans"/>
           <w:sz w:val="20"/>
           <w:szCs w:val="20"/>
         </w:rPr>
-        <w:t xml:space="preserve">      ├── </w:t>
-      </w:r>
-      <w:proofErr w:type="gramStart"/>
+      </w:pPr>
       <w:r>
         <w:rPr>
           <w:rFonts w:ascii="Consolas" w:hAnsi="Consolas" w:cs="Open Sans"/>
           <w:sz w:val="20"/>
           <w:szCs w:val="20"/>
         </w:rPr>
-        <w:t xml:space="preserve">GestionTareasView.java </w:t>
-      </w:r>
-      <w:r>
+        <w:t>└── persistencia/</w:t>
+      </w:r>
+    </w:p>
+    <w:p>
+      <w:pPr>
+        <w:shd w:val="clear" w:color="auto" w:fill="F2F2F2" w:themeFill="background1" w:themeFillShade="F2"/>
         <w:rPr>
           <w:rFonts w:ascii="Consolas" w:hAnsi="Consolas" w:cs="Open Sans"/>
           <w:sz w:val="20"/>
           <w:szCs w:val="20"/>
         </w:rPr>
-        <w:t xml:space="preserve"> </w:t>
-      </w:r>
+      </w:pPr>
       <w:r>
         <w:rPr>
           <w:rFonts w:ascii="Consolas" w:hAnsi="Consolas" w:cs="Open Sans"/>
           <w:sz w:val="20"/>
           <w:szCs w:val="20"/>
         </w:rPr>
-        <w:t>(</w:t>
-      </w:r>
-      <w:proofErr w:type="gramEnd"/>
-      <w:r>
+        <w:t xml:space="preserve">    ├── ConexionBD.java</w:t>
+      </w:r>
+    </w:p>
+    <w:p>
+      <w:pPr>
+        <w:shd w:val="clear" w:color="auto" w:fill="F2F2F2" w:themeFill="background1" w:themeFillShade="F2"/>
         <w:rPr>
           <w:rFonts w:ascii="Consolas" w:hAnsi="Consolas" w:cs="Open Sans"/>
           <w:sz w:val="20"/>
           <w:szCs w:val="20"/>
         </w:rPr>
-        <w:t>Interfaz gráfica Swing)</w:t>
-      </w:r>
-    </w:p>
-    <w:p>
-      <w:pPr>
-        <w:shd w:val="clear" w:color="auto" w:fill="F2F2F2" w:themeFill="background1" w:themeFillShade="F2"/>
+      </w:pPr>
+      <w:r>
         <w:rPr>
           <w:rFonts w:ascii="Consolas" w:hAnsi="Consolas" w:cs="Open Sans"/>
           <w:sz w:val="20"/>
           <w:szCs w:val="20"/>
         </w:rPr>
-      </w:pPr>
-      <w:r>
+        <w:t xml:space="preserve">    ├── EmpleadoRepositorio.java</w:t>
+      </w:r>
+    </w:p>
+    <w:p>
+      <w:pPr>
+        <w:shd w:val="clear" w:color="auto" w:fill="F2F2F2" w:themeFill="background1" w:themeFillShade="F2"/>
         <w:rPr>
           <w:rFonts w:ascii="Consolas" w:hAnsi="Consolas" w:cs="Open Sans"/>
           <w:sz w:val="20"/>
           <w:szCs w:val="20"/>
         </w:rPr>
-        <w:t xml:space="preserve">      └── SelectorFechaPanel.java (Selector de fecha: calendario + texto</w:t>
-      </w:r>
+      </w:pPr>
       <w:r>
         <w:rPr>
           <w:rFonts w:ascii="Consolas" w:hAnsi="Consolas" w:cs="Open Sans"/>
           <w:sz w:val="20"/>
           <w:szCs w:val="20"/>
         </w:rPr>
-        <w:t xml:space="preserve"> </w:t>
-      </w:r>
-      <w:r>
-        <w:rPr>
-          <w:rFonts w:ascii="Consolas" w:hAnsi="Consolas" w:cs="Open Sans"/>
-          <w:sz w:val="20"/>
-          <w:szCs w:val="20"/>
-        </w:rPr>
-        <w:t>validado)</w:t>
+        <w:t xml:space="preserve">    └── TareaRepositorio.java</w:t>
       </w:r>
     </w:p>
     <w:p>
@@ -4090,7 +3978,7 @@
           <w:szCs w:val="22"/>
         </w:rPr>
       </w:pPr>
-      <w:bookmarkStart w:id="21" w:name="_Toc240916959"/>
+      <w:bookmarkStart w:id="21" w:name="_Toc241003984"/>
       <w:r>
         <w:rPr>
           <w:rFonts w:ascii="Open Sans" w:eastAsiaTheme="minorHAnsi" w:hAnsi="Open Sans" w:cs="Open Sans"/>
@@ -5524,7 +5412,7 @@
           <w:szCs w:val="22"/>
         </w:rPr>
       </w:pPr>
-      <w:bookmarkStart w:id="22" w:name="_Toc240916960"/>
+      <w:bookmarkStart w:id="22" w:name="_Toc241003985"/>
       <w:r>
         <w:rPr>
           <w:rFonts w:ascii="Open Sans" w:eastAsiaTheme="minorHAnsi" w:hAnsi="Open Sans" w:cs="Open Sans"/>
@@ -5942,7 +5830,7 @@
           <w:szCs w:val="22"/>
         </w:rPr>
         <w:pict w14:anchorId="7BA412A0">
-          <v:rect id="_x0000_i1025" style="width:0;height:1.5pt" o:hralign="center" o:hrstd="t" o:hr="t" fillcolor="#a0a0a0" stroked="f"/>
+          <v:rect id="_x0000_i1049" style="width:0;height:1.5pt" o:hralign="center" o:hrstd="t" o:hr="t" fillcolor="#a0a0a0" stroked="f"/>
         </w:pict>
       </w:r>
     </w:p>
@@ -6624,7 +6512,7 @@
           <w:szCs w:val="22"/>
         </w:rPr>
         <w:pict w14:anchorId="70DB0A5A">
-          <v:rect id="_x0000_i1026" style="width:0;height:1.5pt" o:hralign="center" o:hrstd="t" o:hr="t" fillcolor="#a0a0a0" stroked="f"/>
+          <v:rect id="_x0000_i1050" style="width:0;height:1.5pt" o:hralign="center" o:hrstd="t" o:hr="t" fillcolor="#a0a0a0" stroked="f"/>
         </w:pict>
       </w:r>
     </w:p>
@@ -7476,7 +7364,7 @@
           <w:rFonts w:ascii="Open Sans" w:hAnsi="Open Sans" w:cs="Open Sans"/>
         </w:rPr>
         <w:pict w14:anchorId="26ECF969">
-          <v:rect id="_x0000_i1027" style="width:0;height:1.5pt" o:hralign="center" o:hrstd="t" o:hr="t" fillcolor="#a0a0a0" stroked="f"/>
+          <v:rect id="_x0000_i1051" style="width:0;height:1.5pt" o:hralign="center" o:hrstd="t" o:hr="t" fillcolor="#a0a0a0" stroked="f"/>
         </w:pict>
       </w:r>
     </w:p>
@@ -8240,7 +8128,7 @@
           <w:rFonts w:ascii="Open Sans" w:hAnsi="Open Sans" w:cs="Open Sans"/>
         </w:rPr>
         <w:pict w14:anchorId="795B87F9">
-          <v:rect id="_x0000_i1028" style="width:0;height:1.5pt" o:hralign="center" o:hrstd="t" o:hr="t" fillcolor="#a0a0a0" stroked="f"/>
+          <v:rect id="_x0000_i1052" style="width:0;height:1.5pt" o:hralign="center" o:hrstd="t" o:hr="t" fillcolor="#a0a0a0" stroked="f"/>
         </w:pict>
       </w:r>
     </w:p>
@@ -8962,7 +8850,7 @@
           <w:rFonts w:ascii="Open Sans" w:hAnsi="Open Sans" w:cs="Open Sans"/>
         </w:rPr>
         <w:pict w14:anchorId="05E41607">
-          <v:rect id="_x0000_i1029" style="width:0;height:1.5pt" o:hralign="center" o:hrstd="t" o:hr="t" fillcolor="#a0a0a0" stroked="f"/>
+          <v:rect id="_x0000_i1053" style="width:0;height:1.5pt" o:hralign="center" o:hrstd="t" o:hr="t" fillcolor="#a0a0a0" stroked="f"/>
         </w:pict>
       </w:r>
     </w:p>
@@ -9750,7 +9638,7 @@
           <w:rFonts w:ascii="Open Sans" w:hAnsi="Open Sans" w:cs="Open Sans"/>
         </w:rPr>
         <w:pict w14:anchorId="69AE62AA">
-          <v:rect id="_x0000_i1030" style="width:0;height:1.5pt" o:hralign="center" o:hrstd="t" o:hr="t" fillcolor="#a0a0a0" stroked="f"/>
+          <v:rect id="_x0000_i1054" style="width:0;height:1.5pt" o:hralign="center" o:hrstd="t" o:hr="t" fillcolor="#a0a0a0" stroked="f"/>
         </w:pict>
       </w:r>
     </w:p>
@@ -11097,7 +10985,7 @@
           <w:szCs w:val="22"/>
         </w:rPr>
       </w:pPr>
-      <w:bookmarkStart w:id="23" w:name="_Toc240916961"/>
+      <w:bookmarkStart w:id="23" w:name="_Toc241003986"/>
       <w:r>
         <w:rPr>
           <w:rFonts w:ascii="Open Sans" w:eastAsiaTheme="minorHAnsi" w:hAnsi="Open Sans" w:cs="Open Sans"/>
@@ -16368,7 +16256,7 @@
         </w:rPr>
         <w:br w:type="page"/>
       </w:r>
-      <w:bookmarkStart w:id="24" w:name="_Toc240916962"/>
+      <w:bookmarkStart w:id="24" w:name="_Toc241003987"/>
       <w:r>
         <w:rPr>
           <w:rFonts w:ascii="Open Sans" w:eastAsiaTheme="minorHAnsi" w:hAnsi="Open Sans" w:cs="Open Sans"/>
@@ -17285,7 +17173,7 @@
           <w:szCs w:val="22"/>
         </w:rPr>
       </w:pPr>
-      <w:bookmarkStart w:id="25" w:name="_Toc240916963"/>
+      <w:bookmarkStart w:id="25" w:name="_Toc241003988"/>
       <w:r>
         <w:rPr>
           <w:rFonts w:ascii="Open Sans" w:eastAsiaTheme="minorHAnsi" w:hAnsi="Open Sans" w:cs="Open Sans"/>
@@ -17697,7 +17585,7 @@
           <w:szCs w:val="22"/>
         </w:rPr>
       </w:pPr>
-      <w:bookmarkStart w:id="26" w:name="_Toc240916964"/>
+      <w:bookmarkStart w:id="26" w:name="_Toc241003989"/>
       <w:r>
         <w:rPr>
           <w:rFonts w:ascii="Open Sans" w:eastAsiaTheme="minorHAnsi" w:hAnsi="Open Sans" w:cs="Open Sans"/>
@@ -17843,16 +17731,65 @@
         <w:rPr>
           <w:rFonts w:ascii="Open Sans" w:hAnsi="Open Sans" w:cs="Open Sans"/>
           <w:b/>
-          <w:lang w:val="es-MX"/>
-        </w:rPr>
-        <w:t xml:space="preserve">Persistencia únicamente en memoria (RAM): </w:t>
-      </w:r>
-      <w:r>
-        <w:rPr>
-          <w:rFonts w:ascii="Open Sans" w:hAnsi="Open Sans" w:cs="Open Sans"/>
-          <w:lang w:val="es-MX"/>
-        </w:rPr>
-        <w:t>cada ejecución del programa parte de cero; no se usa archivo ni base de datos, para mantener el enfoque de la entrega en las estructuras de datos y algoritmos.</w:t>
+          <w:bCs/>
+          <w:lang w:val="es-MX"/>
+        </w:rPr>
+        <w:t>Persistencia mediante base de datos:</w:t>
+      </w:r>
+      <w:r>
+        <w:rPr>
+          <w:rFonts w:ascii="Open Sans" w:hAnsi="Open Sans" w:cs="Open Sans"/>
+          <w:lang w:val="es-MX"/>
+        </w:rPr>
+        <w:t xml:space="preserve"> las tareas y empleados se almacenan en una base de datos a través de una capa de persistencia dedicada (paquete persistencia: </w:t>
+      </w:r>
+      <w:proofErr w:type="spellStart"/>
+      <w:r>
+        <w:rPr>
+          <w:rFonts w:ascii="Open Sans" w:hAnsi="Open Sans" w:cs="Open Sans"/>
+          <w:lang w:val="es-MX"/>
+        </w:rPr>
+        <w:t>ConexionBD</w:t>
+      </w:r>
+      <w:proofErr w:type="spellEnd"/>
+      <w:r>
+        <w:rPr>
+          <w:rFonts w:ascii="Open Sans" w:hAnsi="Open Sans" w:cs="Open Sans"/>
+          <w:lang w:val="es-MX"/>
+        </w:rPr>
+        <w:t xml:space="preserve">, </w:t>
+      </w:r>
+      <w:proofErr w:type="spellStart"/>
+      <w:r>
+        <w:rPr>
+          <w:rFonts w:ascii="Open Sans" w:hAnsi="Open Sans" w:cs="Open Sans"/>
+          <w:lang w:val="es-MX"/>
+        </w:rPr>
+        <w:t>TareaRepositorio</w:t>
+      </w:r>
+      <w:proofErr w:type="spellEnd"/>
+      <w:r>
+        <w:rPr>
+          <w:rFonts w:ascii="Open Sans" w:hAnsi="Open Sans" w:cs="Open Sans"/>
+          <w:lang w:val="es-MX"/>
+        </w:rPr>
+        <w:t xml:space="preserve">, </w:t>
+      </w:r>
+      <w:proofErr w:type="spellStart"/>
+      <w:r>
+        <w:rPr>
+          <w:rFonts w:ascii="Open Sans" w:hAnsi="Open Sans" w:cs="Open Sans"/>
+          <w:lang w:val="es-MX"/>
+        </w:rPr>
+        <w:t>EmpleadoRepositorio</w:t>
+      </w:r>
+      <w:proofErr w:type="spellEnd"/>
+      <w:r>
+        <w:rPr>
+          <w:rFonts w:ascii="Open Sans" w:hAnsi="Open Sans" w:cs="Open Sans"/>
+          <w:lang w:val="es-MX"/>
+        </w:rPr>
+        <w:t>), independiente de las estructuras de datos en memoria (Pila, Cola, Lista, Árbol, etc.), que siguen siendo las responsables de resolver la lógica y los algoritmos del sistema. Esta separación permite que la información se conserve entre ejecuciones sin acoplar la persistencia a las estructuras académicas evaluadas.</w:t>
       </w:r>
     </w:p>
     <w:p>
@@ -18234,7 +18171,7 @@
           <w:szCs w:val="22"/>
         </w:rPr>
       </w:pPr>
-      <w:bookmarkStart w:id="27" w:name="_Toc240916965"/>
+      <w:bookmarkStart w:id="27" w:name="_Toc241003990"/>
       <w:r>
         <w:rPr>
           <w:rFonts w:ascii="Open Sans" w:eastAsiaTheme="minorHAnsi" w:hAnsi="Open Sans" w:cs="Open Sans"/>
@@ -18791,7 +18728,7 @@
           <w:szCs w:val="32"/>
         </w:rPr>
       </w:pPr>
-      <w:bookmarkStart w:id="28" w:name="_Toc240916966"/>
+      <w:bookmarkStart w:id="28" w:name="_Toc241003991"/>
       <w:r>
         <w:rPr>
           <w:rFonts w:ascii="Open Sans" w:eastAsiaTheme="minorHAnsi" w:hAnsi="Open Sans" w:cs="Open Sans"/>
@@ -18879,24 +18816,26 @@
       </w:pPr>
       <w:r>
         <w:rPr>
-          <w:b/>
-          <w:sz w:val="22"/>
-          <w:szCs w:val="22"/>
-        </w:rPr>
-        <w:t xml:space="preserve">Nota general: </w:t>
-      </w:r>
-      <w:r>
-        <w:rPr>
-          <w:color w:val="222222"/>
-          <w:sz w:val="22"/>
-          <w:szCs w:val="22"/>
-        </w:rPr>
-        <w:t xml:space="preserve">Los </w:t>
+          <w:rFonts w:ascii="Open Sans" w:hAnsi="Open Sans" w:cs="Open Sans"/>
+          <w:b/>
+          <w:bCs/>
+          <w:sz w:val="22"/>
+          <w:szCs w:val="22"/>
+        </w:rPr>
+        <w:t>Nota general:</w:t>
+      </w:r>
+      <w:r>
+        <w:rPr>
+          <w:rFonts w:ascii="Open Sans" w:hAnsi="Open Sans" w:cs="Open Sans"/>
+          <w:sz w:val="22"/>
+          <w:szCs w:val="22"/>
+        </w:rPr>
+        <w:t xml:space="preserve"> los </w:t>
       </w:r>
       <w:proofErr w:type="spellStart"/>
       <w:r>
         <w:rPr>
-          <w:color w:val="222222"/>
+          <w:rFonts w:ascii="Open Sans" w:hAnsi="Open Sans" w:cs="Open Sans"/>
           <w:sz w:val="22"/>
           <w:szCs w:val="22"/>
         </w:rPr>
@@ -18905,11 +18844,11 @@
       <w:proofErr w:type="spellEnd"/>
       <w:r>
         <w:rPr>
-          <w:color w:val="222222"/>
-          <w:sz w:val="22"/>
-          <w:szCs w:val="22"/>
-        </w:rPr>
-        <w:t xml:space="preserve"> de las tareas se autogeneran de forma secuencial (1, 2, 3…) desde el inicio de cada ejecución del programa. Si ejecutas los casos en un orden distinto al aquí propuesto, los números de ID que veas en pantalla pueden variar; lo importante es verificar que el comportamiento coincida con el resultado esperado descrito.</w:t>
+          <w:rFonts w:ascii="Open Sans" w:hAnsi="Open Sans" w:cs="Open Sans"/>
+          <w:sz w:val="22"/>
+          <w:szCs w:val="22"/>
+        </w:rPr>
+        <w:t xml:space="preserve"> de las tareas se autogeneran de forma secuencial y se conservan entre ejecuciones gracias a la base de datos. Si ya existen tareas guardadas de sesiones anteriores, los números de ID que veas en pantalla pueden no coincidir exactamente con los usados en estos casos; lo importante es verificar que el comportamiento coincida con el resultado esperado descrito.</w:t>
       </w:r>
     </w:p>
     <w:p>
@@ -22817,6 +22756,7 @@
         <w:rPr>
           <w:rFonts w:ascii="Arial" w:hAnsi="Arial"/>
           <w:b/>
+          <w:noProof/>
           <w:szCs w:val="22"/>
         </w:rPr>
         <w:drawing>
@@ -22867,6 +22807,7 @@
         <w:rPr>
           <w:rFonts w:ascii="Arial" w:hAnsi="Arial"/>
           <w:b/>
+          <w:noProof/>
           <w:szCs w:val="22"/>
         </w:rPr>
         <w:drawing>
@@ -23146,6 +23087,7 @@
       <w:r>
         <w:rPr>
           <w:rFonts w:ascii="Open Sans" w:hAnsi="Open Sans" w:cs="Open Sans"/>
+          <w:noProof/>
           <w:sz w:val="22"/>
           <w:szCs w:val="22"/>
         </w:rPr>
@@ -23459,6 +23401,7 @@
         <w:rPr>
           <w:rFonts w:ascii="Arial" w:hAnsi="Arial"/>
           <w:b/>
+          <w:noProof/>
           <w:szCs w:val="22"/>
         </w:rPr>
         <w:drawing>
@@ -23518,6 +23461,7 @@
         <w:rPr>
           <w:rFonts w:ascii="Arial" w:hAnsi="Arial"/>
           <w:b/>
+          <w:noProof/>
           <w:szCs w:val="22"/>
         </w:rPr>
         <w:drawing>
@@ -23899,6 +23843,7 @@
       <w:r>
         <w:rPr>
           <w:rFonts w:ascii="Open Sans" w:hAnsi="Open Sans" w:cs="Open Sans"/>
+          <w:noProof/>
           <w:sz w:val="22"/>
           <w:szCs w:val="22"/>
         </w:rPr>
@@ -23952,6 +23897,7 @@
       <w:r>
         <w:rPr>
           <w:rFonts w:ascii="Open Sans" w:hAnsi="Open Sans" w:cs="Open Sans"/>
+          <w:noProof/>
           <w:sz w:val="22"/>
           <w:szCs w:val="22"/>
         </w:rPr>
@@ -24005,6 +23951,7 @@
       <w:r>
         <w:rPr>
           <w:rFonts w:ascii="Open Sans" w:hAnsi="Open Sans" w:cs="Open Sans"/>
+          <w:noProof/>
           <w:sz w:val="22"/>
           <w:szCs w:val="22"/>
         </w:rPr>
@@ -24058,6 +24005,7 @@
       <w:r>
         <w:rPr>
           <w:rFonts w:ascii="Open Sans" w:hAnsi="Open Sans" w:cs="Open Sans"/>
+          <w:noProof/>
           <w:sz w:val="22"/>
           <w:szCs w:val="22"/>
         </w:rPr>
@@ -24381,6 +24329,7 @@
         <w:rPr>
           <w:rFonts w:ascii="Arial" w:hAnsi="Arial"/>
           <w:b/>
+          <w:noProof/>
           <w:szCs w:val="22"/>
         </w:rPr>
         <w:drawing>
@@ -24641,6 +24590,7 @@
       <w:r>
         <w:rPr>
           <w:rFonts w:ascii="Open Sans" w:hAnsi="Open Sans" w:cs="Open Sans"/>
+          <w:noProof/>
           <w:sz w:val="22"/>
           <w:szCs w:val="22"/>
         </w:rPr>
@@ -25246,6 +25196,7 @@
       <w:r>
         <w:rPr>
           <w:rFonts w:ascii="Open Sans" w:hAnsi="Open Sans" w:cs="Open Sans"/>
+          <w:noProof/>
           <w:sz w:val="22"/>
           <w:szCs w:val="22"/>
         </w:rPr>
@@ -25331,6 +25282,7 @@
       <w:r>
         <w:rPr>
           <w:rFonts w:ascii="Open Sans" w:hAnsi="Open Sans" w:cs="Open Sans"/>
+          <w:noProof/>
           <w:sz w:val="22"/>
           <w:szCs w:val="22"/>
         </w:rPr>
@@ -25451,6 +25403,7 @@
       <w:r>
         <w:rPr>
           <w:rFonts w:ascii="Open Sans" w:hAnsi="Open Sans" w:cs="Open Sans"/>
+          <w:noProof/>
           <w:sz w:val="22"/>
           <w:szCs w:val="22"/>
         </w:rPr>
@@ -25676,6 +25629,7 @@
       <w:r>
         <w:rPr>
           <w:rFonts w:ascii="Open Sans" w:hAnsi="Open Sans" w:cs="Open Sans"/>
+          <w:noProof/>
           <w:sz w:val="22"/>
           <w:szCs w:val="22"/>
         </w:rPr>
@@ -25752,7 +25706,7 @@
           <w:szCs w:val="32"/>
         </w:rPr>
       </w:pPr>
-      <w:bookmarkStart w:id="31" w:name="_Toc240916967"/>
+      <w:bookmarkStart w:id="31" w:name="_Toc241003992"/>
       <w:r>
         <w:rPr>
           <w:rFonts w:ascii="Open Sans" w:eastAsiaTheme="minorHAnsi" w:hAnsi="Open Sans" w:cs="Open Sans"/>
@@ -25840,23 +25794,7 @@
           <w:sz w:val="22"/>
           <w:szCs w:val="22"/>
         </w:rPr>
-        <w:t xml:space="preserve">En una etapa posterior, la reorganización del componente de presentación en unidades cohesivas y de responsabilidad única, apoyada en una clase de utilidades de estilo compartida, respondió a un criterio de mantenibilidad que trasciende la correctitud funcional: un sistema técnicamente </w:t>
-      </w:r>
-      <w:r>
-        <w:rPr>
-          <w:rFonts w:ascii="Open Sans" w:hAnsi="Open Sans" w:cs="Open Sans"/>
-          <w:sz w:val="22"/>
-          <w:szCs w:val="22"/>
-        </w:rPr>
-        <w:t>correcto,</w:t>
-      </w:r>
-      <w:r>
-        <w:rPr>
-          <w:rFonts w:ascii="Open Sans" w:hAnsi="Open Sans" w:cs="Open Sans"/>
-          <w:sz w:val="22"/>
-          <w:szCs w:val="22"/>
-        </w:rPr>
-        <w:t xml:space="preserve"> pero pobremente modularizado compromete su evolución futura. Esta refactorización, sumada a la incorporación de mecanismos de entrada de datos más robustos como la validación estricta de fechas bajo un formato normalizado y la doble modalidad de captura manual y mediante selector visual, demuestra que el rigor algorítmico y la usabilidad de la interfaz no son </w:t>
+        <w:t xml:space="preserve">En una etapa posterior, la reorganización del componente de presentación en unidades cohesivas y de responsabilidad única, apoyada en una clase de utilidades de estilo compartida, respondió a un criterio de mantenibilidad que trasciende la correctitud funcional: un sistema técnicamente correcto, pero pobremente modularizado compromete su evolución futura. Esta refactorización, sumada a la incorporación de mecanismos de entrada de datos más robustos como la validación estricta de fechas bajo un formato normalizado y la doble modalidad de captura manual y mediante selector visual, demuestra que el rigor algorítmico y la usabilidad de la interfaz no son </w:t>
       </w:r>
       <w:r>
         <w:rPr>
@@ -25883,7 +25821,49 @@
           <w:sz w:val="22"/>
           <w:szCs w:val="22"/>
         </w:rPr>
-        <w:t xml:space="preserve">En términos generales, el proyecto satisface los objetivos planteados: implementa correctamente las estructuras y algoritmos avanzados requeridos, los documenta con un nivel de detalle que permite su comprensión y mantenimiento por terceros, optimiza las operaciones de asignación, consulta y organización de tareas mediante estructuras con complejidad algorítmica adecuada a cada operación, y permite una demostración funcional completa de cada componente. No obstante, resulta pertinente reconocer, con la honestidad que exige la redacción científica, ciertas limitaciones de diseño que no comprometen la validez del sistema pero delimitan su alcance actual entre ellas, la comparación lexicográfica de identificadores en el árbol de empleados y la ausencia de persistencia entre ejecuciones, las cuales constituyen líneas naturales de trabajo futuro, como la adopción de estructuras </w:t>
+        <w:t xml:space="preserve">En términos generales, el proyecto satisface los objetivos planteados: implementa correctamente las estructuras y algoritmos avanzados requeridos, los documenta con un nivel de detalle que permite su comprensión y mantenimiento por terceros, optimiza las operaciones de asignación, consulta y organización de tareas mediante estructuras con complejidad algorítmica adecuada a cada operación, y permite una </w:t>
+      </w:r>
+      <w:r>
+        <w:rPr>
+          <w:rFonts w:ascii="Open Sans" w:hAnsi="Open Sans" w:cs="Open Sans"/>
+          <w:sz w:val="22"/>
+          <w:szCs w:val="22"/>
+        </w:rPr>
+        <w:t>demostración funcion</w:t>
+      </w:r>
+      <w:r>
+        <w:rPr>
+          <w:rFonts w:ascii="Open Sans" w:hAnsi="Open Sans" w:cs="Open Sans"/>
+          <w:sz w:val="22"/>
+          <w:szCs w:val="22"/>
+        </w:rPr>
+        <w:t xml:space="preserve">al completa de cada componente. No obstante, resulta pertinente reconocer, con la honestidad que exige la redacción científica, ciertas limitaciones de diseño que no comprometen la validez del </w:t>
+      </w:r>
+      <w:proofErr w:type="gramStart"/>
+      <w:r>
+        <w:rPr>
+          <w:rFonts w:ascii="Open Sans" w:hAnsi="Open Sans" w:cs="Open Sans"/>
+          <w:sz w:val="22"/>
+          <w:szCs w:val="22"/>
+        </w:rPr>
+        <w:t>sistema</w:t>
+      </w:r>
+      <w:proofErr w:type="gramEnd"/>
+      <w:r>
+        <w:rPr>
+          <w:rFonts w:ascii="Open Sans" w:hAnsi="Open Sans" w:cs="Open Sans"/>
+          <w:sz w:val="22"/>
+          <w:szCs w:val="22"/>
+        </w:rPr>
+        <w:t xml:space="preserve"> pero delimitan su alcance actual </w:t>
+      </w:r>
+      <w:r>
+        <w:rPr>
+          <w:rFonts w:ascii="Open Sans" w:hAnsi="Open Sans" w:cs="Open Sans"/>
+          <w:sz w:val="22"/>
+          <w:szCs w:val="22"/>
+        </w:rPr>
+        <w:t xml:space="preserve">entre ellas, la comparación lexicográfica de identificadores en el árbol de empleados—, la cual constituye una línea natural de trabajo futuro, como la adopción de estructuras </w:t>
       </w:r>
       <w:proofErr w:type="spellStart"/>
       <w:r>
@@ -25901,7 +25881,7 @@
           <w:sz w:val="22"/>
           <w:szCs w:val="22"/>
         </w:rPr>
-        <w:t xml:space="preserve"> o la incorporación de una capa de almacenamiento persistente.</w:t>
+        <w:t>. Cabe señalar que, en una iteración posterior, el sistema incorporó una capa de persistencia basada en base de datos (paquete persistencia), superando así la limitación inicial de pérdida de información entre ejecuciones y consolidando su viabilidad como una herramienta de uso continuo.</w:t>
       </w:r>
     </w:p>
     <w:p>
@@ -25920,6 +25900,30 @@
           <w:szCs w:val="22"/>
         </w:rPr>
         <w:t>En síntesis, el proyecto no solo cumple una función evaluativa dentro del curso de Estructuras de Datos, sino que constituye un ejercicio representativo de cómo la teoría algorítmica se traduce en decisiones de ingeniería concretas, sujetas a verificación, corrección y mejora continua, principios que resultan transferibles a cualquier contexto de desarrollo de software profesional.</w:t>
+      </w:r>
+    </w:p>
+    <w:p>
+      <w:pPr>
+        <w:rPr>
+          <w:rFonts w:ascii="Open Sans" w:hAnsi="Open Sans" w:cs="Open Sans"/>
+          <w:b/>
+          <w:bCs/>
+          <w:sz w:val="32"/>
+          <w:szCs w:val="32"/>
+        </w:rPr>
+      </w:pPr>
+      <w:bookmarkStart w:id="32" w:name="_Toc238245601"/>
+      <w:bookmarkStart w:id="33" w:name="_Toc239195295"/>
+      <w:bookmarkStart w:id="34" w:name="_Toc239453196"/>
+      <w:r>
+        <w:rPr>
+          <w:rFonts w:ascii="Open Sans" w:hAnsi="Open Sans" w:cs="Open Sans"/>
+          <w:b/>
+          <w:bCs/>
+          <w:sz w:val="32"/>
+          <w:szCs w:val="32"/>
+        </w:rPr>
+        <w:br w:type="page"/>
       </w:r>
     </w:p>
     <w:p>
@@ -25935,10 +25939,7 @@
           <w:szCs w:val="32"/>
         </w:rPr>
       </w:pPr>
-      <w:bookmarkStart w:id="32" w:name="_Toc238245601"/>
-      <w:bookmarkStart w:id="33" w:name="_Toc239195295"/>
-      <w:bookmarkStart w:id="34" w:name="_Toc239453196"/>
-      <w:bookmarkStart w:id="35" w:name="_Toc240916968"/>
+      <w:bookmarkStart w:id="35" w:name="_Toc241003993"/>
       <w:r>
         <w:rPr>
           <w:rFonts w:ascii="Open Sans" w:eastAsiaTheme="minorHAnsi" w:hAnsi="Open Sans" w:cs="Open Sans"/>
@@ -25948,6 +25949,7 @@
           <w:sz w:val="32"/>
           <w:szCs w:val="32"/>
         </w:rPr>
+        <w:lastRenderedPageBreak/>
         <w:t>Referencias Bibliográficas</w:t>
       </w:r>
       <w:bookmarkEnd w:id="32"/>
@@ -26096,7 +26098,6 @@
         <w:rPr>
           <w:rFonts w:ascii="Arial" w:hAnsi="Arial" w:cs="Arial"/>
         </w:rPr>
-        <w:lastRenderedPageBreak/>
         <w:t xml:space="preserve">Gómez, A. (2023). Estructuras de datos. Clase 14-Colas de prioridad. Recuperado de </w:t>
       </w:r>
       <w:hyperlink r:id="rId49" w:history="1">

</xml_diff>